<commit_message>
State the optional line-up check accurately and drop two unused imports
The report and the "How it works" slide said no line-up is used. The app has an optional,
reviewer-connected line-up check that no reported number uses. The report now describes it
with the test result and its caveats, the slides say a line-up is optional, and the
scalability slide gives the 53.0% to 64.2% test with true squads. Removes the Form and Path
imports that the upload removal left unused in app.py.

Co-Authored-By: Claude Sonnet 5.5 <noreply@anthropic.com>
</commit_message>
<xml_diff>
--- a/Documentation/PitchProfile_Model_Documentation.docx
+++ b/Documentation/PitchProfile_Model_Documentation.docx
@@ -706,7 +706,7 @@
         <w:spacing w:after="120" w:line="288"/>
       </w:pPr>
       <w:r>
-        <w:t xml:space="preserve">PitchProfile takes the broadcast video of a football match and produces, for every player it can see, a set of statistics: where the player was, how far and how fast they moved, and what they did with the ball. The video is the only input. No tracking feed, event feed or line-up is used by the analysis. Public annotations (SoccerNet, SoccerTrack, FOOTPASS) are used only to train models and to measure how well they work.</w:t>
+        <w:t xml:space="preserve">PitchProfile takes the broadcast video of a football match and produces, for every player it can see, a set of statistics: where the player was, how far and how fast they moved, and what they did with the ball. The video is the only input. No tracking feed or event feed is used. A match line-up can optionally be connected to help name players (Section 2.9), but no number in this report uses one. Public annotations (SoccerNet, SoccerTrack, FOOTPASS) are used only to train models and to measure how well they work.</w:t>
       </w:r>
     </w:p>
     <w:p>
@@ -3181,6 +3181,21 @@
     </w:p>
     <w:p>
       <w:pPr>
+        <w:spacing w:after="120" w:line="288"/>
+      </w:pPr>
+      <w:r>
+        <w:rPr>
+          <w:b/>
+          <w:bCs/>
+        </w:rPr>
+        <w:t xml:space="preserve">Optional line-up.</w:t>
+      </w:r>
+      <w:r>
+        <w:t xml:space="preserve"> If a reviewer connects the match line-up and confirms which kit group is which team, the shirt numbers that played check the naming. A number nobody in the line-up wore is treated as a misreading, and an unnamed group is named when one line-up number not yet taken holds at least 90% of its readable votes (and at least 20% of all its votes). In a test on the three held-out FOOTPASS games, with each team's true squad as the line-up, the share of visible time named right rose from 53.0% to 64.2% and wrong names went from 3.0% to 2.7%. That test was run before the later changes (today's video-only figure is 52.3%), without the 20% guard wrong names rose to 5.1%, and it has not been measured with real provider line-ups. None of the figures elsewhere in this report use a line-up.</w:t>
+      </w:r>
+    </w:p>
+    <w:p>
+      <w:pPr>
         <w:pStyle w:val="Heading2"/>
       </w:pPr>
       <w:r>
@@ -17352,7 +17367,7 @@
         <w:t xml:space="preserve">Identity is partial.</w:t>
       </w:r>
       <w:r>
-        <w:t xml:space="preserve"> About half of player time is tied to a named player, and 95% of those names are right. The rest sits in consistent unnumbered players, and one real player is sometimes split across several of them. Striped kits are read worst.</w:t>
+        <w:t xml:space="preserve"> About half of player time is tied to a named player, and 95% of those names are right. The rest sits in consistent unnumbered players, and one real player is sometimes split across several of them. Striped kits are read worst. Connecting the match line-up can raise it (Section 2.9), but that was only tested with true squads.</w:t>
       </w:r>
     </w:p>
     <w:p>

</xml_diff>